<commit_message>
Belge arşivi: kantin seti 2026.09 + öğretmenler kurulu seti 2026.09
okul-kantini-belgeleri 2026.09: GNL-KNT-FR-006 satış listesi 17.08.2026 tarihli
Sağlık Bakanlığı Bilim Kurulu Karar Tutanağına (merkezisgb 31.08.2026; 06.03.2025
tutanağının yerini aldı) göre yeniden yazıldı — besin skoru istisnaları (cips A-B,
çikolata A-B-C), E 171 ve gevrek çerez çıktı, eritme peynir eklendi, işlenmiş et
eşikleri; okul gıdası logosu 14.09.2026'dan itibaren yürürlükte; set mevzuat teyit
tarihi 14.09.2026.

ogretmenler-kurulu-tutanaklari 2026.09: OKT-001 KARAR 13 son cümlesi düzeltildi,
sayfa numarası/başlık tekrarı; yeni GNL-OKR-OKT-004 ara toplantı tutanağı (Bakanlığın
10.09.2026 tarihli sosyal etkinlikler seti) — set 4 belge.

Co-Authored-By: Claude Fable 5.1 <noreply@anthropic.com>
</commit_message>
<xml_diff>
--- a/public/evrak/ogretmenler-kurulu-tutanaklari/GNL-OKR-OKT-002_Ikinci_Donem_Basi_Ogretmenler_Kurulu_Cerceve_Tutanagi_2026-2027_v1.0.docx
+++ b/public/evrak/ogretmenler-kurulu-tutanaklari/GNL-OKR-OKT-002_Ikinci_Donem_Basi_Ogretmenler_Kurulu_Cerceve_Tutanagi_2026-2027_v1.0.docx
@@ -222,7 +222,7 @@
                 <w:i w:val="0"/>
                 <w:sz w:val="18"/>
               </w:rPr>
-              <w:t>• Bu belge, okulapp.org üzerinde yayımlanan GENEL TUTANAK ŞABLONU setinin parçasıdır (sürüm: 2026.08.4 (29.08.2026)). Resmî bir Bakanlık belgesi değildir; okulun şartlarına ve toplantıda gerçekten görüşülen hususlara göre uyarlanır. Metindeki mevzuat atıfları 28.08.2026 tarihi itibarıyla yürürlükteki hükümlere göre yazılmıştır; kullanmadan önce güncelliği kontrol ediniz. Lisans: CC BY 4.0 — kaynak gösterilerek kullanılabilir ve uyarlanabilir.</w:t>
+              <w:t>• Bu belge, okulapp.org üzerinde yayımlanan GENEL TUTANAK ŞABLONU setinin parçasıdır (sürüm: 2026.09 (14.09.2026)). Resmî bir Bakanlık belgesi değildir; okulun şartlarına ve toplantıda gerçekten görüşülen hususlara göre uyarlanır. Metindeki mevzuat atıfları 28.08.2026 tarihi itibarıyla yürürlükteki hükümlere göre yazılmıştır; kullanmadan önce güncelliği kontrol ediniz. Lisans: CC BY 4.0 — kaynak gösterilerek kullanılabilir ve uyarlanabilir.</w:t>
             </w:r>
           </w:p>
           <w:p>
@@ -1107,7 +1107,7 @@
           <w:i w:val="0"/>
           <w:sz w:val="20"/>
         </w:rPr>
-        <w:t>Eğitim Kurulları ve Zümreleri Yönergesinin 9 uncu maddesinin yedinci fıkrasının (a) bendi uyarınca 01.09.2026 tarihli sene başı kurulunun kararları madde madde okundu. Geç gelme usulünün işleyişi, bilişim araçları uygulaması, nöbet esasları, okul kurallarının uygulanması ve sınav yönergesi süreci, kurul ile komisyon seçim ve görevlendirmelerinin işleyişi ve genelgeden doğan uygulama esasları (randevu sistemi üzerinden veli görüşmeleri, okul kaynaklı deneme ve tarama sınavı yapılmaması, gelişim raporlarının süresinde doldurulması, önlük uygulaması ve öğretmen eğitimi modüllerinin tamamlanma durumu) tek tek değerlendirildi; gerçekleşmeyen kararlar için sorumlu ve takvim güncellendi.</w:t>
+        <w:t>Eğitim Kurulları ve Zümreleri Yönergesinin 9 uncu maddesinin yedinci fıkrasının (a) bendi uyarınca 07.09.2026 tarihli sene başı kurulunun kararları madde madde okundu. Geç gelme usulünün işleyişi, bilişim araçları uygulaması, nöbet esasları, okul kurallarının uygulanması ve sınav yönergesi süreci, kurul ile komisyon seçim ve görevlendirmelerinin işleyişi ve genelgeden doğan uygulama esasları (randevu sistemi üzerinden veli görüşmeleri, okul kaynaklı deneme ve tarama sınavı yapılmaması, gelişim raporlarının süresinde doldurulması, önlük uygulaması ve öğretmen eğitimi modüllerinin tamamlanma durumu) tek tek değerlendirildi; gerçekleşmeyen kararlar için sorumlu ve takvim güncellendi.</w:t>
       </w:r>
     </w:p>
     <w:p>
@@ -1938,13 +1938,57 @@
           </w:tcPr>
           <w:p>
             <w:r/>
+            <w:sdt>
+              <w:sdtPr>
+                <w14:checkbox>
+                  <w14:checked w14:val="0"/>
+                  <w14:checkedState w14:val="2612" w14:font="MS Gothic"/>
+                  <w14:uncheckedState w14:val="2610" w14:font="MS Gothic"/>
+                </w14:checkbox>
+              </w:sdtPr>
+              <w:sdtContent>
+                <w:r>
+                  <w:rPr>
+                    <w:rFonts w:ascii="MS Gothic" w:hAnsi="MS Gothic" w:eastAsia="MS Gothic"/>
+                    <w:sz w:val="18"/>
+                  </w:rPr>
+                  <w:t>☐</w:t>
+                </w:r>
+              </w:sdtContent>
+            </w:sdt>
             <w:r>
               <w:rPr>
                 <w:b w:val="0"/>
                 <w:i w:val="0"/>
                 <w:sz w:val="18"/>
               </w:rPr>
-              <w:t>☐ Mevcut okul kıyafetinin sürdürülmesi uygundur    ☐ Değişiklik önerilir (gelecek öğretim yılından geçerli)</w:t>
+              <w:t xml:space="preserve"> Mevcut okul kıyafetinin sürdürülmesi uygundur    </w:t>
+            </w:r>
+            <w:sdt>
+              <w:sdtPr>
+                <w14:checkbox>
+                  <w14:checked w14:val="0"/>
+                  <w14:checkedState w14:val="2612" w14:font="MS Gothic"/>
+                  <w14:uncheckedState w14:val="2610" w14:font="MS Gothic"/>
+                </w14:checkbox>
+              </w:sdtPr>
+              <w:sdtContent>
+                <w:r>
+                  <w:rPr>
+                    <w:rFonts w:ascii="MS Gothic" w:hAnsi="MS Gothic" w:eastAsia="MS Gothic"/>
+                    <w:sz w:val="18"/>
+                  </w:rPr>
+                  <w:t>☐</w:t>
+                </w:r>
+              </w:sdtContent>
+            </w:sdt>
+            <w:r>
+              <w:rPr>
+                <w:b w:val="0"/>
+                <w:i w:val="0"/>
+                <w:sz w:val="18"/>
+              </w:rPr>
+              <w:t xml:space="preserve"> Değişiklik önerilir (gelecek öğretim yılından geçerli)</w:t>
             </w:r>
           </w:p>
         </w:tc>
@@ -2057,7 +2101,7 @@
           <w:i w:val="0"/>
           <w:sz w:val="20"/>
         </w:rPr>
-        <w:t>Sınav takviminin öğretim yılı başında ilan edildiği, değişikliğin ancak mücbir sebeple ve il veya ilçe millî eğitim müdürlüğü onayıyla yapılabileceği belirtilerek ikinci dönem sınav pencereleri teyit edildi. Okul sınav uygulama yönergesinin birinci dönem uygulaması — teslim süreleri, sınav evrakının ilgili zümrece karşılıklı sayımla teslimi ve sınavı olan ders öğretmeninin sınav saatinde okulda hazır bulunması ile mazeret akışı — değerlendirildi; aksayan yönlerin zümre başkanları kuruluna bildirileceği ifade edildi.</w:t>
+        <w:t>Sınav takviminin öğretim yılı başında ilan edildiği, mücbir sebeple okul geneli sınav tarihlerinin okul müdürlüğünce değiştirilebileceği ve il veya ilçe millî eğitim müdürlüğü onayıyla yapılabileceği belirtilerek ikinci dönem sınav pencereleri teyit edildi. Okul sınav uygulama yönergesinin birinci dönem uygulaması — teslim süreleri, sınav evrakının ilgili zümrece karşılıklı sayımla teslimi ve sınavı olan ders öğretmeninin sınav saatinde okulda hazır bulunması ile mazeret akışı — değerlendirildi; aksayan yönlerin zümre başkanları kuruluna bildirileceği ifade edildi.</w:t>
       </w:r>
     </w:p>
     <w:p>
@@ -2179,13 +2223,57 @@
           </w:tcPr>
           <w:p>
             <w:r/>
+            <w:sdt>
+              <w:sdtPr>
+                <w14:checkbox>
+                  <w14:checked w14:val="0"/>
+                  <w14:checkedState w14:val="2612" w14:font="MS Gothic"/>
+                  <w14:uncheckedState w14:val="2610" w14:font="MS Gothic"/>
+                </w14:checkbox>
+              </w:sdtPr>
+              <w:sdtContent>
+                <w:r>
+                  <w:rPr>
+                    <w:rFonts w:ascii="MS Gothic" w:hAnsi="MS Gothic" w:eastAsia="MS Gothic"/>
+                    <w:sz w:val="18"/>
+                  </w:rPr>
+                  <w:t>☐</w:t>
+                </w:r>
+              </w:sdtContent>
+            </w:sdt>
             <w:r>
               <w:rPr>
                 <w:b w:val="0"/>
                 <w:i w:val="0"/>
                 <w:sz w:val="18"/>
               </w:rPr>
-              <w:t>☐ Teyit edildi   ☐ Değişiklik gerekir (mücbir sebep ve millî eğitim müdürlüğü onayı)</w:t>
+              <w:t xml:space="preserve"> Teyit edildi   </w:t>
+            </w:r>
+            <w:sdt>
+              <w:sdtPr>
+                <w14:checkbox>
+                  <w14:checked w14:val="0"/>
+                  <w14:checkedState w14:val="2612" w14:font="MS Gothic"/>
+                  <w14:uncheckedState w14:val="2610" w14:font="MS Gothic"/>
+                </w14:checkbox>
+              </w:sdtPr>
+              <w:sdtContent>
+                <w:r>
+                  <w:rPr>
+                    <w:rFonts w:ascii="MS Gothic" w:hAnsi="MS Gothic" w:eastAsia="MS Gothic"/>
+                    <w:sz w:val="18"/>
+                  </w:rPr>
+                  <w:t>☐</w:t>
+                </w:r>
+              </w:sdtContent>
+            </w:sdt>
+            <w:r>
+              <w:rPr>
+                <w:b w:val="0"/>
+                <w:i w:val="0"/>
+                <w:sz w:val="18"/>
+              </w:rPr>
+              <w:t xml:space="preserve"> Değişiklik gerekir (mücbir sebep)</w:t>
             </w:r>
           </w:p>
         </w:tc>
@@ -2229,13 +2317,57 @@
           </w:tcPr>
           <w:p>
             <w:r/>
+            <w:sdt>
+              <w:sdtPr>
+                <w14:checkbox>
+                  <w14:checked w14:val="0"/>
+                  <w14:checkedState w14:val="2612" w14:font="MS Gothic"/>
+                  <w14:uncheckedState w14:val="2610" w14:font="MS Gothic"/>
+                </w14:checkbox>
+              </w:sdtPr>
+              <w:sdtContent>
+                <w:r>
+                  <w:rPr>
+                    <w:rFonts w:ascii="MS Gothic" w:hAnsi="MS Gothic" w:eastAsia="MS Gothic"/>
+                    <w:sz w:val="18"/>
+                  </w:rPr>
+                  <w:t>☐</w:t>
+                </w:r>
+              </w:sdtContent>
+            </w:sdt>
             <w:r>
               <w:rPr>
                 <w:b w:val="0"/>
                 <w:i w:val="0"/>
                 <w:sz w:val="18"/>
               </w:rPr>
-              <w:t>☐ Teyit edildi   ☐ Değişiklik gerekir (mücbir sebep ve millî eğitim müdürlüğü onayı)</w:t>
+              <w:t xml:space="preserve"> Teyit edildi   </w:t>
+            </w:r>
+            <w:sdt>
+              <w:sdtPr>
+                <w14:checkbox>
+                  <w14:checked w14:val="0"/>
+                  <w14:checkedState w14:val="2612" w14:font="MS Gothic"/>
+                  <w14:uncheckedState w14:val="2610" w14:font="MS Gothic"/>
+                </w14:checkbox>
+              </w:sdtPr>
+              <w:sdtContent>
+                <w:r>
+                  <w:rPr>
+                    <w:rFonts w:ascii="MS Gothic" w:hAnsi="MS Gothic" w:eastAsia="MS Gothic"/>
+                    <w:sz w:val="18"/>
+                  </w:rPr>
+                  <w:t>☐</w:t>
+                </w:r>
+              </w:sdtContent>
+            </w:sdt>
+            <w:r>
+              <w:rPr>
+                <w:b w:val="0"/>
+                <w:i w:val="0"/>
+                <w:sz w:val="18"/>
+              </w:rPr>
+              <w:t xml:space="preserve"> Değişiklik gerekir (mücbir sebep)</w:t>
             </w:r>
           </w:p>
         </w:tc>
@@ -2275,7 +2407,7 @@
           <w:color w:val="C00000"/>
           <w:sz w:val="20"/>
         </w:rPr>
-        <w:t>[Değişiklik gerekiyorsa mücbir sebep gerekçesi ile il/ilçe millî eğitim müdürlüğü onay süreci: … ]</w:t>
+        <w:t>[Değişiklik gerekiyorsa mücbir sebep gerekçesi kayda geçirilerek okul müdürlüğünce yapılacak ve e-Okul'a işlenecektir; il/ilçe millî eğitim müdürlüğü onay süreci: … ]</w:t>
       </w:r>
     </w:p>
     <w:p>
@@ -2900,7 +3032,7 @@
                 <w:i w:val="0"/>
                 <w:sz w:val="18"/>
               </w:rPr>
-              <w:t>Genel veli toplantısı</w:t>
+              <w:t>Genel veli toplantısı (II. dönem)</w:t>
             </w:r>
           </w:p>
         </w:tc>
@@ -2941,7 +3073,7 @@
                 <w:i w:val="0"/>
                 <w:sz w:val="18"/>
               </w:rPr>
-              <w:t>Yönerge md.9/7-s; okul planlaması</w:t>
+              <w:t>Yönerge md.9/7-s; okul planlaması — 1. sınavların bitiminden (09.04.2027) en az on gün sonraki uygun pazar</w:t>
             </w:r>
           </w:p>
         </w:tc>
@@ -3454,7 +3586,7 @@
           <w:color w:val="C00000"/>
           <w:sz w:val="20"/>
         </w:rPr>
-        <w:t>[Değişiklik gerekiyorsa mücbir sebep gerekçesi ile il/ilçe millî eğitim müdürlüğü onay süreci: … ]</w:t>
+        <w:t>[Değişiklik gerekiyorsa mücbir sebep gerekçesi kayda geçirilerek okul müdürlüğünce yapılacak ve e-Okul'a işlenecektir; il/ilçe millî eğitim müdürlüğü onay süreci: … ]</w:t>
       </w:r>
     </w:p>
     <w:p>
@@ -4308,23 +4440,23 @@
           <w:i w:val="0"/>
           <w:sz w:val="18"/>
         </w:rPr>
-        <w:t>Çizelge, kurul üyesi sayısına göre çoğaltılır; izinli veya raporlu personel açıklama sütununda gösterilir ve tutanağı sonradan imzalar.</w:t>
+        <w:t>Çizelge, kurul üyesi sayısına göre çoğaltılır; izinli veya raporlu personel açıklama sütununda gösterilir ve tutanağı sonradan imzalar. Okul müdürü kurul başkanı ve kararların onay makamı olduğundan çizelgede üye olarak yer almaz.</w:t>
       </w:r>
     </w:p>
     <w:tbl>
       <w:tblPr>
         <w:tblStyle w:val="TableGrid"/>
-        <w:tblW w:w="10092" w:type="dxa"/>
+        <w:tblW w:w="10091" w:type="dxa"/>
         <w:jc w:val="center"/>
         <w:tblLayout w:type="fixed"/>
         <w:tblLook w:firstColumn="1" w:firstRow="1" w:lastColumn="0" w:lastRow="0" w:noHBand="0" w:noVBand="1" w:val="04A0"/>
       </w:tblPr>
       <w:tblGrid>
-        <w:gridCol w:w="794"/>
+        <w:gridCol w:w="680"/>
         <w:gridCol w:w="3061"/>
-        <w:gridCol w:w="2608"/>
+        <w:gridCol w:w="2835"/>
         <w:gridCol w:w="1701"/>
-        <w:gridCol w:w="1928"/>
+        <w:gridCol w:w="1814"/>
       </w:tblGrid>
       <w:tr>
         <w:trPr>
@@ -4332,7 +4464,7 @@
         </w:trPr>
         <w:tc>
           <w:tcPr>
-            <w:tcW w:w="794" w:type="dxa"/>
+            <w:tcW w:w="680" w:type="dxa"/>
             <w:shd w:val="clear" w:fill="F2F2F2"/>
           </w:tcPr>
           <w:p>
@@ -4374,7 +4506,7 @@
         </w:tc>
         <w:tc>
           <w:tcPr>
-            <w:tcW w:w="2608" w:type="dxa"/>
+            <w:tcW w:w="2835" w:type="dxa"/>
             <w:shd w:val="clear" w:fill="F2F2F2"/>
           </w:tcPr>
           <w:p>
@@ -4416,7 +4548,7 @@
         </w:tc>
         <w:tc>
           <w:tcPr>
-            <w:tcW w:w="1928" w:type="dxa"/>
+            <w:tcW w:w="1814" w:type="dxa"/>
             <w:shd w:val="clear" w:fill="F2F2F2"/>
           </w:tcPr>
           <w:p>
@@ -4442,7 +4574,7 @@
         </w:trPr>
         <w:tc>
           <w:tcPr>
-            <w:tcW w:w="794" w:type="dxa"/>
+            <w:tcW w:w="680" w:type="dxa"/>
           </w:tcPr>
           <w:p>
             <w:pPr>
@@ -4474,7 +4606,7 @@
         </w:tc>
         <w:tc>
           <w:tcPr>
-            <w:tcW w:w="2608" w:type="dxa"/>
+            <w:tcW w:w="2835" w:type="dxa"/>
           </w:tcPr>
           <w:p>
             <w:pPr>
@@ -4498,7 +4630,7 @@
         </w:tc>
         <w:tc>
           <w:tcPr>
-            <w:tcW w:w="1928" w:type="dxa"/>
+            <w:tcW w:w="1814" w:type="dxa"/>
           </w:tcPr>
           <w:p>
             <w:pPr>
@@ -4515,7 +4647,7 @@
         </w:trPr>
         <w:tc>
           <w:tcPr>
-            <w:tcW w:w="794" w:type="dxa"/>
+            <w:tcW w:w="680" w:type="dxa"/>
           </w:tcPr>
           <w:p>
             <w:pPr>
@@ -4547,7 +4679,7 @@
         </w:tc>
         <w:tc>
           <w:tcPr>
-            <w:tcW w:w="2608" w:type="dxa"/>
+            <w:tcW w:w="2835" w:type="dxa"/>
           </w:tcPr>
           <w:p>
             <w:pPr>
@@ -4571,7 +4703,7 @@
         </w:tc>
         <w:tc>
           <w:tcPr>
-            <w:tcW w:w="1928" w:type="dxa"/>
+            <w:tcW w:w="1814" w:type="dxa"/>
           </w:tcPr>
           <w:p>
             <w:pPr>
@@ -4588,7 +4720,7 @@
         </w:trPr>
         <w:tc>
           <w:tcPr>
-            <w:tcW w:w="794" w:type="dxa"/>
+            <w:tcW w:w="680" w:type="dxa"/>
           </w:tcPr>
           <w:p>
             <w:pPr>
@@ -4620,7 +4752,7 @@
         </w:tc>
         <w:tc>
           <w:tcPr>
-            <w:tcW w:w="2608" w:type="dxa"/>
+            <w:tcW w:w="2835" w:type="dxa"/>
           </w:tcPr>
           <w:p>
             <w:pPr>
@@ -4644,7 +4776,7 @@
         </w:tc>
         <w:tc>
           <w:tcPr>
-            <w:tcW w:w="1928" w:type="dxa"/>
+            <w:tcW w:w="1814" w:type="dxa"/>
           </w:tcPr>
           <w:p>
             <w:pPr>
@@ -4661,7 +4793,7 @@
         </w:trPr>
         <w:tc>
           <w:tcPr>
-            <w:tcW w:w="794" w:type="dxa"/>
+            <w:tcW w:w="680" w:type="dxa"/>
           </w:tcPr>
           <w:p>
             <w:pPr>
@@ -4693,7 +4825,7 @@
         </w:tc>
         <w:tc>
           <w:tcPr>
-            <w:tcW w:w="2608" w:type="dxa"/>
+            <w:tcW w:w="2835" w:type="dxa"/>
           </w:tcPr>
           <w:p>
             <w:pPr>
@@ -4717,7 +4849,7 @@
         </w:tc>
         <w:tc>
           <w:tcPr>
-            <w:tcW w:w="1928" w:type="dxa"/>
+            <w:tcW w:w="1814" w:type="dxa"/>
           </w:tcPr>
           <w:p>
             <w:pPr>
@@ -4734,7 +4866,7 @@
         </w:trPr>
         <w:tc>
           <w:tcPr>
-            <w:tcW w:w="794" w:type="dxa"/>
+            <w:tcW w:w="680" w:type="dxa"/>
           </w:tcPr>
           <w:p>
             <w:pPr>
@@ -4766,7 +4898,7 @@
         </w:tc>
         <w:tc>
           <w:tcPr>
-            <w:tcW w:w="2608" w:type="dxa"/>
+            <w:tcW w:w="2835" w:type="dxa"/>
           </w:tcPr>
           <w:p>
             <w:pPr>
@@ -4790,7 +4922,7 @@
         </w:tc>
         <w:tc>
           <w:tcPr>
-            <w:tcW w:w="1928" w:type="dxa"/>
+            <w:tcW w:w="1814" w:type="dxa"/>
           </w:tcPr>
           <w:p>
             <w:pPr>
@@ -4807,7 +4939,7 @@
         </w:trPr>
         <w:tc>
           <w:tcPr>
-            <w:tcW w:w="794" w:type="dxa"/>
+            <w:tcW w:w="680" w:type="dxa"/>
           </w:tcPr>
           <w:p>
             <w:pPr>
@@ -4839,7 +4971,7 @@
         </w:tc>
         <w:tc>
           <w:tcPr>
-            <w:tcW w:w="2608" w:type="dxa"/>
+            <w:tcW w:w="2835" w:type="dxa"/>
           </w:tcPr>
           <w:p>
             <w:pPr>
@@ -4863,7 +4995,7 @@
         </w:tc>
         <w:tc>
           <w:tcPr>
-            <w:tcW w:w="1928" w:type="dxa"/>
+            <w:tcW w:w="1814" w:type="dxa"/>
           </w:tcPr>
           <w:p>
             <w:pPr>
@@ -4880,7 +5012,7 @@
         </w:trPr>
         <w:tc>
           <w:tcPr>
-            <w:tcW w:w="794" w:type="dxa"/>
+            <w:tcW w:w="680" w:type="dxa"/>
           </w:tcPr>
           <w:p>
             <w:pPr>
@@ -4912,7 +5044,7 @@
         </w:tc>
         <w:tc>
           <w:tcPr>
-            <w:tcW w:w="2608" w:type="dxa"/>
+            <w:tcW w:w="2835" w:type="dxa"/>
           </w:tcPr>
           <w:p>
             <w:pPr>
@@ -4936,7 +5068,7 @@
         </w:tc>
         <w:tc>
           <w:tcPr>
-            <w:tcW w:w="1928" w:type="dxa"/>
+            <w:tcW w:w="1814" w:type="dxa"/>
           </w:tcPr>
           <w:p>
             <w:pPr>
@@ -4953,7 +5085,7 @@
         </w:trPr>
         <w:tc>
           <w:tcPr>
-            <w:tcW w:w="794" w:type="dxa"/>
+            <w:tcW w:w="680" w:type="dxa"/>
           </w:tcPr>
           <w:p>
             <w:pPr>
@@ -4985,7 +5117,7 @@
         </w:tc>
         <w:tc>
           <w:tcPr>
-            <w:tcW w:w="2608" w:type="dxa"/>
+            <w:tcW w:w="2835" w:type="dxa"/>
           </w:tcPr>
           <w:p>
             <w:pPr>
@@ -5009,7 +5141,7 @@
         </w:tc>
         <w:tc>
           <w:tcPr>
-            <w:tcW w:w="1928" w:type="dxa"/>
+            <w:tcW w:w="1814" w:type="dxa"/>
           </w:tcPr>
           <w:p>
             <w:pPr>
@@ -5026,7 +5158,7 @@
         </w:trPr>
         <w:tc>
           <w:tcPr>
-            <w:tcW w:w="794" w:type="dxa"/>
+            <w:tcW w:w="680" w:type="dxa"/>
           </w:tcPr>
           <w:p>
             <w:pPr>
@@ -5058,7 +5190,7 @@
         </w:tc>
         <w:tc>
           <w:tcPr>
-            <w:tcW w:w="2608" w:type="dxa"/>
+            <w:tcW w:w="2835" w:type="dxa"/>
           </w:tcPr>
           <w:p>
             <w:pPr>
@@ -5082,7 +5214,7 @@
         </w:tc>
         <w:tc>
           <w:tcPr>
-            <w:tcW w:w="1928" w:type="dxa"/>
+            <w:tcW w:w="1814" w:type="dxa"/>
           </w:tcPr>
           <w:p>
             <w:pPr>
@@ -5099,7 +5231,7 @@
         </w:trPr>
         <w:tc>
           <w:tcPr>
-            <w:tcW w:w="794" w:type="dxa"/>
+            <w:tcW w:w="680" w:type="dxa"/>
           </w:tcPr>
           <w:p>
             <w:pPr>
@@ -5131,7 +5263,7 @@
         </w:tc>
         <w:tc>
           <w:tcPr>
-            <w:tcW w:w="2608" w:type="dxa"/>
+            <w:tcW w:w="2835" w:type="dxa"/>
           </w:tcPr>
           <w:p>
             <w:pPr>
@@ -5155,7 +5287,7 @@
         </w:tc>
         <w:tc>
           <w:tcPr>
-            <w:tcW w:w="1928" w:type="dxa"/>
+            <w:tcW w:w="1814" w:type="dxa"/>
           </w:tcPr>
           <w:p>
             <w:pPr>
@@ -5172,7 +5304,7 @@
         </w:trPr>
         <w:tc>
           <w:tcPr>
-            <w:tcW w:w="794" w:type="dxa"/>
+            <w:tcW w:w="680" w:type="dxa"/>
           </w:tcPr>
           <w:p>
             <w:pPr>
@@ -5204,7 +5336,7 @@
         </w:tc>
         <w:tc>
           <w:tcPr>
-            <w:tcW w:w="2608" w:type="dxa"/>
+            <w:tcW w:w="2835" w:type="dxa"/>
           </w:tcPr>
           <w:p>
             <w:pPr>
@@ -5228,7 +5360,7 @@
         </w:tc>
         <w:tc>
           <w:tcPr>
-            <w:tcW w:w="1928" w:type="dxa"/>
+            <w:tcW w:w="1814" w:type="dxa"/>
           </w:tcPr>
           <w:p>
             <w:pPr>
@@ -5245,7 +5377,7 @@
         </w:trPr>
         <w:tc>
           <w:tcPr>
-            <w:tcW w:w="794" w:type="dxa"/>
+            <w:tcW w:w="680" w:type="dxa"/>
           </w:tcPr>
           <w:p>
             <w:r/>
@@ -5269,7 +5401,7 @@
         </w:tc>
         <w:tc>
           <w:tcPr>
-            <w:tcW w:w="2608" w:type="dxa"/>
+            <w:tcW w:w="2835" w:type="dxa"/>
           </w:tcPr>
           <w:p>
             <w:r/>
@@ -5285,7 +5417,7 @@
         </w:tc>
         <w:tc>
           <w:tcPr>
-            <w:tcW w:w="1928" w:type="dxa"/>
+            <w:tcW w:w="1814" w:type="dxa"/>
           </w:tcPr>
           <w:p>
             <w:r/>
@@ -5299,6 +5431,7 @@
       </w:pPr>
     </w:p>
     <w:sectPr>
+      <w:footerReference w:type="default" r:id="rId9"/>
       <w:pgSz w:w="11906" w:h="16838"/>
       <w:pgMar w:top="1020" w:right="907" w:bottom="1020" w:left="907" w:header="720" w:footer="720" w:gutter="0"/>
       <w:cols w:space="720"/>
@@ -5306,6 +5439,94 @@
     </w:sectPr>
   </w:body>
 </w:document>
+</file>
+
+<file path=word/footer1.xml><?xml version="1.0" encoding="utf-8"?>
+<w:ftr xmlns:m="http://schemas.openxmlformats.org/officeDocument/2006/math" xmlns:mc="http://schemas.openxmlformats.org/markup-compatibility/2006" xmlns:mo="http://schemas.microsoft.com/office/mac/office/2008/main" xmlns:mv="urn:schemas-microsoft-com:mac:vml" xmlns:o="urn:schemas-microsoft-com:office:office" xmlns:r="http://schemas.openxmlformats.org/officeDocument/2006/relationships" xmlns:v="urn:schemas-microsoft-com:vml" xmlns:w10="urn:schemas-microsoft-com:office:word" xmlns:w14="http://schemas.microsoft.com/office/word/2010/wordml" xmlns:w="http://schemas.openxmlformats.org/wordprocessingml/2006/main" xmlns:wne="http://schemas.microsoft.com/office/word/2006/wordml" xmlns:wp14="http://schemas.microsoft.com/office/word/2010/wordprocessingDrawing" xmlns:wp="http://schemas.openxmlformats.org/drawingml/2006/wordprocessingDrawing" xmlns:wpc="http://schemas.microsoft.com/office/word/2010/wordprocessingCanvas" xmlns:wpg="http://schemas.microsoft.com/office/word/2010/wordprocessingGroup" xmlns:wpi="http://schemas.microsoft.com/office/word/2010/wordprocessingInk" xmlns:wps="http://schemas.microsoft.com/office/word/2010/wordprocessingShape" mc:Ignorable="w14 wp14">
+  <w:p>
+    <w:pPr>
+      <w:pStyle w:val="Footer"/>
+      <w:spacing w:before="40" w:after="0"/>
+      <w:jc w:val="center"/>
+    </w:pPr>
+    <w:r>
+      <w:rPr>
+        <w:b w:val="0"/>
+        <w:i w:val="0"/>
+        <w:sz w:val="18"/>
+      </w:rPr>
+      <w:t xml:space="preserve">Sayfa </w:t>
+    </w:r>
+    <w:r>
+      <w:rPr>
+        <w:sz w:val="18"/>
+      </w:rPr>
+      <w:fldChar w:fldCharType="begin"/>
+    </w:r>
+    <w:r>
+      <w:rPr>
+        <w:sz w:val="18"/>
+      </w:rPr>
+      <w:instrText xml:space="preserve"> PAGE </w:instrText>
+    </w:r>
+    <w:r>
+      <w:rPr>
+        <w:sz w:val="18"/>
+      </w:rPr>
+      <w:fldChar w:fldCharType="separate"/>
+    </w:r>
+    <w:r>
+      <w:rPr>
+        <w:sz w:val="18"/>
+      </w:rPr>
+      <w:t>1</w:t>
+    </w:r>
+    <w:r>
+      <w:rPr>
+        <w:sz w:val="18"/>
+      </w:rPr>
+      <w:fldChar w:fldCharType="end"/>
+    </w:r>
+    <w:r>
+      <w:rPr>
+        <w:b w:val="0"/>
+        <w:i w:val="0"/>
+        <w:sz w:val="18"/>
+      </w:rPr>
+      <w:t xml:space="preserve"> / </w:t>
+    </w:r>
+    <w:r>
+      <w:rPr>
+        <w:sz w:val="18"/>
+      </w:rPr>
+      <w:fldChar w:fldCharType="begin"/>
+    </w:r>
+    <w:r>
+      <w:rPr>
+        <w:sz w:val="18"/>
+      </w:rPr>
+      <w:instrText xml:space="preserve"> NUMPAGES </w:instrText>
+    </w:r>
+    <w:r>
+      <w:rPr>
+        <w:sz w:val="18"/>
+      </w:rPr>
+      <w:fldChar w:fldCharType="separate"/>
+    </w:r>
+    <w:r>
+      <w:rPr>
+        <w:sz w:val="18"/>
+      </w:rPr>
+      <w:t>1</w:t>
+    </w:r>
+    <w:r>
+      <w:rPr>
+        <w:sz w:val="18"/>
+      </w:rPr>
+      <w:fldChar w:fldCharType="end"/>
+    </w:r>
+  </w:p>
+</w:ftr>
 </file>
 
 <file path=word/numbering.xml><?xml version="1.0" encoding="utf-8"?>

</xml_diff>